<commit_message>
Add Google Workspace section to Password & Bitwarden Guide
</commit_message>
<xml_diff>
--- a/reference-docs/Password_Bitwarden_Guide.docx
+++ b/reference-docs/Password_Bitwarden_Guide.docx
@@ -536,7 +536,141 @@
           <w:sz w:val="24"/>
           <w:szCs w:val="24"/>
         </w:rPr>
-        <w:t xml:space="preserve">3. Changing a Password For a Shared Login</w:t>
+        <w:t xml:space="preserve">3. Google Workspace</w:t>
+      </w:r>
+    </w:p>
+    <w:p>
+      <w:pPr>
+        <w:spacing w:after="160"/>
+      </w:pPr>
+      <w:r>
+        <w:rPr>
+          <w:rFonts w:ascii="Arial" w:cs="Arial" w:eastAsia="Arial" w:hAnsi="Arial"/>
+          <w:color w:val="3A3A36"/>
+          <w:sz w:val="21"/>
+          <w:szCs w:val="21"/>
+        </w:rPr>
+        <w:t xml:space="preserve">Google Workspace (the @revitalproductions.com domain) manages its own authentication — Bitwarden stores a copy of the password for reference, but the actual login, 2FA enforcement, and account lifecycle happen in the Google Admin console, not in Bitwarden.</w:t>
+      </w:r>
+    </w:p>
+    <w:p>
+      <w:pPr>
+        <w:spacing w:after="60" w:before="120"/>
+      </w:pPr>
+      <w:r>
+        <w:rPr>
+          <w:rFonts w:ascii="Arial" w:cs="Arial" w:eastAsia="Arial" w:hAnsi="Arial"/>
+          <w:b/>
+          <w:bCs/>
+          <w:color w:val="D85A30"/>
+          <w:sz w:val="20"/>
+          <w:szCs w:val="20"/>
+        </w:rPr>
+        <w:t xml:space="preserve">Domain-wide 2-Step Verification</w:t>
+      </w:r>
+    </w:p>
+    <w:p>
+      <w:pPr>
+        <w:spacing w:after="100"/>
+      </w:pPr>
+      <w:r>
+        <w:rPr>
+          <w:rFonts w:ascii="Arial" w:cs="Arial" w:eastAsia="Arial" w:hAnsi="Arial"/>
+          <w:color w:val="3A3A36"/>
+          <w:sz w:val="21"/>
+          <w:szCs w:val="21"/>
+        </w:rPr>
+        <w:t xml:space="preserve">Admin console → Security → Authentication → 2-step verification → set Enforcement to On (or On from [date] to give the team a grace period before it's required). Google already mandates 2SV for every admin account regardless of org policy — since 2025, super admins get about 90 days' notice and other admins 60 days before it's forced on their account. The domain-wide switch extends that same requirement to every teammate's login, not just admins.</w:t>
+      </w:r>
+    </w:p>
+    <w:p>
+      <w:pPr>
+        <w:spacing w:after="60" w:before="120"/>
+      </w:pPr>
+      <w:r>
+        <w:rPr>
+          <w:rFonts w:ascii="Arial" w:cs="Arial" w:eastAsia="Arial" w:hAnsi="Arial"/>
+          <w:b/>
+          <w:bCs/>
+          <w:color w:val="D85A30"/>
+          <w:sz w:val="20"/>
+          <w:szCs w:val="20"/>
+        </w:rPr>
+        <w:t xml:space="preserve">Changing an individual's password</w:t>
+      </w:r>
+    </w:p>
+    <w:p>
+      <w:pPr>
+        <w:spacing w:after="100"/>
+      </w:pPr>
+      <w:r>
+        <w:rPr>
+          <w:rFonts w:ascii="Arial" w:cs="Arial" w:eastAsia="Arial" w:hAnsi="Arial"/>
+          <w:color w:val="3A3A36"/>
+          <w:sz w:val="21"/>
+          <w:szCs w:val="21"/>
+        </w:rPr>
+        <w:t xml:space="preserve">A teammate's Workspace password is changed at myaccount.google.com, or force-reset by an admin from the Admin console (Users → select the person → Reset password). This lives outside Bitwarden's control — update it on the Google side first, then update the saved copy in Bitwarden so the vault stays accurate.</w:t>
+      </w:r>
+    </w:p>
+    <w:p>
+      <w:pPr>
+        <w:spacing w:after="60" w:before="120"/>
+      </w:pPr>
+      <w:r>
+        <w:rPr>
+          <w:rFonts w:ascii="Arial" w:cs="Arial" w:eastAsia="Arial" w:hAnsi="Arial"/>
+          <w:b/>
+          <w:bCs/>
+          <w:color w:val="D85A30"/>
+          <w:sz w:val="20"/>
+          <w:szCs w:val="20"/>
+        </w:rPr>
+        <w:t xml:space="preserve">App-specific passwords</w:t>
+      </w:r>
+    </w:p>
+    <w:p>
+      <w:pPr>
+        <w:spacing w:after="100"/>
+      </w:pPr>
+      <w:r>
+        <w:rPr>
+          <w:rFonts w:ascii="Arial" w:cs="Arial" w:eastAsia="Arial" w:hAnsi="Arial"/>
+          <w:color w:val="3A3A36"/>
+          <w:sz w:val="21"/>
+          <w:szCs w:val="21"/>
+        </w:rPr>
+        <w:t xml:space="preserve">Google is phasing these out in favor of OAuth and passkeys — legacy protocols like IMAP/SMTP/POP with a stored password are being retired. If a tool asks for an 'app password' for Gmail or Calendar, treat that as a sign to look for an OAuth-based connection instead of storing a long-lived credential.</w:t>
+      </w:r>
+    </w:p>
+    <w:p>
+      <w:pPr>
+        <w:spacing w:after="60" w:before="120"/>
+      </w:pPr>
+      <w:r>
+        <w:rPr>
+          <w:rFonts w:ascii="Arial" w:cs="Arial" w:eastAsia="Arial" w:hAnsi="Arial"/>
+          <w:b/>
+          <w:bCs/>
+          <w:color w:val="D85A30"/>
+          <w:sz w:val="20"/>
+          <w:szCs w:val="20"/>
+        </w:rPr>
+        <w:t xml:space="preserve">Offboarding a Workspace user — suspend first, delete later</w:t>
+      </w:r>
+    </w:p>
+    <w:p>
+      <w:pPr>
+        <w:spacing w:after="80"/>
+      </w:pPr>
+      <w:r>
+        <w:rPr>
+          <w:rFonts w:ascii="Arial" w:cs="Arial" w:eastAsia="Arial" w:hAnsi="Arial"/>
+          <w:color w:val="3A3A36"/>
+          <w:sz w:val="21"/>
+          <w:szCs w:val="21"/>
+        </w:rPr>
+        <w:t xml:space="preserve">Deleting an account immediately and permanently destroys anything not already transferred — Drive files, email, calendar events. Suspending blocks sign-in without touching the data, so it's always the first move:</w:t>
       </w:r>
     </w:p>
     <w:p>
@@ -565,7 +699,7 @@
           <w:sz w:val="21"/>
           <w:szCs w:val="21"/>
         </w:rPr>
-        <w:t xml:space="preserve">Open the item in its shared collection inside Bitwarden. You need Edit permission on that collection — if you don't have it, ask the org owner to grant it or make the change for you.</w:t>
+        <w:t xml:space="preserve">Suspend the account in the Admin console (Users) — this locks them out immediately without deleting anything.</w:t>
       </w:r>
     </w:p>
     <w:p>
@@ -594,7 +728,7 @@
           <w:sz w:val="21"/>
           <w:szCs w:val="21"/>
         </w:rPr>
-        <w:t xml:space="preserve">Use Bitwarden's password generator to create a new, random password (15+ characters for anything privileged).</w:t>
+        <w:t xml:space="preserve">Sign them out of all active sessions and reset the password.</w:t>
       </w:r>
     </w:p>
     <w:p>
@@ -623,7 +757,7 @@
           <w:sz w:val="21"/>
           <w:szCs w:val="21"/>
         </w:rPr>
-        <w:t xml:space="preserve">Go to the actual site and update the password there first.</w:t>
+        <w:t xml:space="preserve">Transfer ownership of their Drive files to a manager or the admin account.</w:t>
       </w:r>
     </w:p>
     <w:p>
@@ -652,7 +786,7 @@
           <w:sz w:val="21"/>
           <w:szCs w:val="21"/>
         </w:rPr>
-        <w:t xml:space="preserve">Come back to the Bitwarden item and save the new password so the vault stays the source of truth.</w:t>
+        <w:t xml:space="preserve">Set up email forwarding or delegation so nothing in their inbox is lost.</w:t>
       </w:r>
     </w:p>
     <w:p>
@@ -681,7 +815,79 @@
           <w:sz w:val="21"/>
           <w:szCs w:val="21"/>
         </w:rPr>
-        <w:t xml:space="preserve">Add a quick note in the item (who changed it and why) so there's a record if anyone asks later.</w:t>
+        <w:t xml:space="preserve">Reassign any calendar events they own.</w:t>
+      </w:r>
+    </w:p>
+    <w:p>
+      <w:pPr>
+        <w:spacing w:after="90"/>
+        <w:ind w:left="360" w:hanging="260"/>
+      </w:pPr>
+      <w:r>
+        <w:rPr>
+          <w:rFonts w:ascii="Arial" w:cs="Arial" w:eastAsia="Arial" w:hAnsi="Arial"/>
+          <w:b/>
+          <w:bCs/>
+          <w:color w:val="D85A30"/>
+          <w:sz w:val="21"/>
+          <w:szCs w:val="21"/>
+        </w:rPr>
+        <w:t xml:space="preserve">6  </w:t>
+      </w:r>
+      <w:r>
+        <w:t xml:space="preserve"/>
+      </w:r>
+      <w:r>
+        <w:rPr>
+          <w:rFonts w:ascii="Arial" w:cs="Arial" w:eastAsia="Arial" w:hAnsi="Arial"/>
+          <w:color w:val="3A3A36"/>
+          <w:sz w:val="21"/>
+          <w:szCs w:val="21"/>
+        </w:rPr>
+        <w:t xml:space="preserve">Remove them from Groups and shared drives.</w:t>
+      </w:r>
+    </w:p>
+    <w:p>
+      <w:pPr>
+        <w:spacing w:after="90"/>
+        <w:ind w:left="360" w:hanging="260"/>
+      </w:pPr>
+      <w:r>
+        <w:rPr>
+          <w:rFonts w:ascii="Arial" w:cs="Arial" w:eastAsia="Arial" w:hAnsi="Arial"/>
+          <w:b/>
+          <w:bCs/>
+          <w:color w:val="D85A30"/>
+          <w:sz w:val="21"/>
+          <w:szCs w:val="21"/>
+        </w:rPr>
+        <w:t xml:space="preserve">7  </w:t>
+      </w:r>
+      <w:r>
+        <w:t xml:space="preserve"/>
+      </w:r>
+      <w:r>
+        <w:rPr>
+          <w:rFonts w:ascii="Arial" w:cs="Arial" w:eastAsia="Arial" w:hAnsi="Arial"/>
+          <w:color w:val="3A3A36"/>
+          <w:sz w:val="21"/>
+          <w:szCs w:val="21"/>
+        </w:rPr>
+        <w:t xml:space="preserve">Only delete the account once everything above is confirmed transferred — deletion also frees up the paid seat if it needs to go to a new hire.</w:t>
+      </w:r>
+    </w:p>
+    <w:p>
+      <w:pPr>
+        <w:spacing w:after="160"/>
+      </w:pPr>
+      <w:r>
+        <w:rPr>
+          <w:rFonts w:ascii="Arial" w:cs="Arial" w:eastAsia="Arial" w:hAnsi="Arial"/>
+          <w:color w:val="3A3A36"/>
+          <w:sz w:val="21"/>
+          <w:szCs w:val="21"/>
+        </w:rPr>
+        <w:t xml:space="preserve">Pair this with the Bitwarden and Hub Team Access offboarding steps below — all three need to happen for someone who's actually leaving.</w:t>
       </w:r>
     </w:p>
     <w:p>
@@ -697,161 +903,152 @@
           <w:sz w:val="24"/>
           <w:szCs w:val="24"/>
         </w:rPr>
-        <w:t xml:space="preserve">4. When To Rotate a Shared Credential</w:t>
-      </w:r>
-    </w:p>
-    <w:p>
-      <w:pPr>
-        <w:spacing w:after="160"/>
-      </w:pPr>
-      <w:r>
-        <w:rPr>
-          <w:rFonts w:ascii="Arial" w:cs="Arial" w:eastAsia="Arial" w:hAnsi="Arial"/>
-          <w:color w:val="3A3A36"/>
-          <w:sz w:val="21"/>
-          <w:szCs w:val="21"/>
-        </w:rPr>
-        <w:t xml:space="preserve">Trigger-based, not scheduled — change a shared password when one of these actually happens:</w:t>
-      </w:r>
-    </w:p>
-    <w:p>
-      <w:pPr>
-        <w:spacing w:after="70"/>
-        <w:ind w:left="300" w:hanging="200"/>
-      </w:pPr>
-      <w:r>
-        <w:rPr>
-          <w:rFonts w:ascii="Arial" w:cs="Arial" w:eastAsia="Arial" w:hAnsi="Arial"/>
-          <w:b/>
-          <w:bCs/>
-          <w:color w:val="D85A30"/>
-          <w:sz w:val="21"/>
-          <w:szCs w:val="21"/>
-        </w:rPr>
-        <w:t xml:space="preserve">•  </w:t>
-      </w:r>
-      <w:r>
-        <w:rPr>
-          <w:rFonts w:ascii="Arial" w:cs="Arial" w:eastAsia="Arial" w:hAnsi="Arial"/>
-          <w:b w:val="false"/>
-          <w:bCs w:val="false"/>
-          <w:color w:val="3A3A36"/>
-          <w:sz w:val="21"/>
-          <w:szCs w:val="21"/>
-        </w:rPr>
-        <w:t xml:space="preserve">A teammate with access to it leaves the company or changes roles.</w:t>
-      </w:r>
-    </w:p>
-    <w:p>
-      <w:pPr>
-        <w:spacing w:after="70"/>
-        <w:ind w:left="300" w:hanging="200"/>
-      </w:pPr>
-      <w:r>
-        <w:rPr>
-          <w:rFonts w:ascii="Arial" w:cs="Arial" w:eastAsia="Arial" w:hAnsi="Arial"/>
-          <w:b/>
-          <w:bCs/>
-          <w:color w:val="D85A30"/>
-          <w:sz w:val="21"/>
-          <w:szCs w:val="21"/>
-        </w:rPr>
-        <w:t xml:space="preserve">•  </w:t>
-      </w:r>
-      <w:r>
-        <w:rPr>
-          <w:rFonts w:ascii="Arial" w:cs="Arial" w:eastAsia="Arial" w:hAnsi="Arial"/>
-          <w:b w:val="false"/>
-          <w:bCs w:val="false"/>
-          <w:color w:val="3A3A36"/>
-          <w:sz w:val="21"/>
-          <w:szCs w:val="21"/>
-        </w:rPr>
-        <w:t xml:space="preserve">A client relationship ends — rotate anything that was shared with or by that client.</w:t>
-      </w:r>
-    </w:p>
-    <w:p>
-      <w:pPr>
-        <w:spacing w:after="70"/>
-        <w:ind w:left="300" w:hanging="200"/>
-      </w:pPr>
-      <w:r>
-        <w:rPr>
-          <w:rFonts w:ascii="Arial" w:cs="Arial" w:eastAsia="Arial" w:hAnsi="Arial"/>
-          <w:b/>
-          <w:bCs/>
-          <w:color w:val="D85A30"/>
-          <w:sz w:val="21"/>
-          <w:szCs w:val="21"/>
-        </w:rPr>
-        <w:t xml:space="preserve">•  </w:t>
-      </w:r>
-      <w:r>
-        <w:rPr>
-          <w:rFonts w:ascii="Arial" w:cs="Arial" w:eastAsia="Arial" w:hAnsi="Arial"/>
-          <w:b w:val="false"/>
-          <w:bCs w:val="false"/>
-          <w:color w:val="3A3A36"/>
-          <w:sz w:val="21"/>
-          <w:szCs w:val="21"/>
-        </w:rPr>
-        <w:t xml:space="preserve">A freelancer or contractor's engagement ends.</w:t>
-      </w:r>
-    </w:p>
-    <w:p>
-      <w:pPr>
-        <w:spacing w:after="70"/>
-        <w:ind w:left="300" w:hanging="200"/>
-      </w:pPr>
-      <w:r>
-        <w:rPr>
-          <w:rFonts w:ascii="Arial" w:cs="Arial" w:eastAsia="Arial" w:hAnsi="Arial"/>
-          <w:b/>
-          <w:bCs/>
-          <w:color w:val="D85A30"/>
-          <w:sz w:val="21"/>
-          <w:szCs w:val="21"/>
-        </w:rPr>
-        <w:t xml:space="preserve">•  </w:t>
-      </w:r>
-      <w:r>
-        <w:rPr>
-          <w:rFonts w:ascii="Arial" w:cs="Arial" w:eastAsia="Arial" w:hAnsi="Arial"/>
-          <w:b w:val="false"/>
-          <w:bCs w:val="false"/>
-          <w:color w:val="3A3A36"/>
-          <w:sz w:val="21"/>
-          <w:szCs w:val="21"/>
-        </w:rPr>
-        <w:t xml:space="preserve">You suspect exposure — a phishing click, a lost or compromised device, or a breach notification for that site.</w:t>
-      </w:r>
-    </w:p>
-    <w:p>
-      <w:pPr>
-        <w:spacing w:after="70"/>
-        <w:ind w:left="300" w:hanging="200"/>
-      </w:pPr>
-      <w:r>
-        <w:rPr>
-          <w:rFonts w:ascii="Arial" w:cs="Arial" w:eastAsia="Arial" w:hAnsi="Arial"/>
-          <w:b/>
-          <w:bCs/>
-          <w:color w:val="D85A30"/>
-          <w:sz w:val="21"/>
-          <w:szCs w:val="21"/>
-        </w:rPr>
-        <w:t xml:space="preserve">•  </w:t>
-      </w:r>
-      <w:r>
-        <w:rPr>
-          <w:rFonts w:ascii="Arial" w:cs="Arial" w:eastAsia="Arial" w:hAnsi="Arial"/>
-          <w:b w:val="false"/>
-          <w:bCs w:val="false"/>
-          <w:color w:val="3A3A36"/>
-          <w:sz w:val="21"/>
-          <w:szCs w:val="21"/>
-        </w:rPr>
-        <w:t xml:space="preserve">Bitwarden's built-in breach report (or a check against HaveIBeenPwned) flags a password as compromised.</w:t>
+        <w:t xml:space="preserve">4. Changing a Password For a Shared Login</w:t>
+      </w:r>
+    </w:p>
+    <w:p>
+      <w:pPr>
+        <w:spacing w:after="90"/>
+        <w:ind w:left="360" w:hanging="260"/>
+      </w:pPr>
+      <w:r>
+        <w:rPr>
+          <w:rFonts w:ascii="Arial" w:cs="Arial" w:eastAsia="Arial" w:hAnsi="Arial"/>
+          <w:b/>
+          <w:bCs/>
+          <w:color w:val="D85A30"/>
+          <w:sz w:val="21"/>
+          <w:szCs w:val="21"/>
+        </w:rPr>
+        <w:t xml:space="preserve">1  </w:t>
+      </w:r>
+      <w:r>
+        <w:t xml:space="preserve"/>
+      </w:r>
+      <w:r>
+        <w:rPr>
+          <w:rFonts w:ascii="Arial" w:cs="Arial" w:eastAsia="Arial" w:hAnsi="Arial"/>
+          <w:color w:val="3A3A36"/>
+          <w:sz w:val="21"/>
+          <w:szCs w:val="21"/>
+        </w:rPr>
+        <w:t xml:space="preserve">Open the item in its shared collection inside Bitwarden. You need Edit permission on that collection — if you don't have it, ask the org owner to grant it or make the change for you.</w:t>
+      </w:r>
+    </w:p>
+    <w:p>
+      <w:pPr>
+        <w:spacing w:after="90"/>
+        <w:ind w:left="360" w:hanging="260"/>
+      </w:pPr>
+      <w:r>
+        <w:rPr>
+          <w:rFonts w:ascii="Arial" w:cs="Arial" w:eastAsia="Arial" w:hAnsi="Arial"/>
+          <w:b/>
+          <w:bCs/>
+          <w:color w:val="D85A30"/>
+          <w:sz w:val="21"/>
+          <w:szCs w:val="21"/>
+        </w:rPr>
+        <w:t xml:space="preserve">2  </w:t>
+      </w:r>
+      <w:r>
+        <w:t xml:space="preserve"/>
+      </w:r>
+      <w:r>
+        <w:rPr>
+          <w:rFonts w:ascii="Arial" w:cs="Arial" w:eastAsia="Arial" w:hAnsi="Arial"/>
+          <w:color w:val="3A3A36"/>
+          <w:sz w:val="21"/>
+          <w:szCs w:val="21"/>
+        </w:rPr>
+        <w:t xml:space="preserve">Use Bitwarden's password generator to create a new, random password (15+ characters for anything privileged).</w:t>
+      </w:r>
+    </w:p>
+    <w:p>
+      <w:pPr>
+        <w:spacing w:after="90"/>
+        <w:ind w:left="360" w:hanging="260"/>
+      </w:pPr>
+      <w:r>
+        <w:rPr>
+          <w:rFonts w:ascii="Arial" w:cs="Arial" w:eastAsia="Arial" w:hAnsi="Arial"/>
+          <w:b/>
+          <w:bCs/>
+          <w:color w:val="D85A30"/>
+          <w:sz w:val="21"/>
+          <w:szCs w:val="21"/>
+        </w:rPr>
+        <w:t xml:space="preserve">3  </w:t>
+      </w:r>
+      <w:r>
+        <w:t xml:space="preserve"/>
+      </w:r>
+      <w:r>
+        <w:rPr>
+          <w:rFonts w:ascii="Arial" w:cs="Arial" w:eastAsia="Arial" w:hAnsi="Arial"/>
+          <w:color w:val="3A3A36"/>
+          <w:sz w:val="21"/>
+          <w:szCs w:val="21"/>
+        </w:rPr>
+        <w:t xml:space="preserve">Go to the actual site and update the password there first.</w:t>
+      </w:r>
+    </w:p>
+    <w:p>
+      <w:pPr>
+        <w:spacing w:after="90"/>
+        <w:ind w:left="360" w:hanging="260"/>
+      </w:pPr>
+      <w:r>
+        <w:rPr>
+          <w:rFonts w:ascii="Arial" w:cs="Arial" w:eastAsia="Arial" w:hAnsi="Arial"/>
+          <w:b/>
+          <w:bCs/>
+          <w:color w:val="D85A30"/>
+          <w:sz w:val="21"/>
+          <w:szCs w:val="21"/>
+        </w:rPr>
+        <w:t xml:space="preserve">4  </w:t>
+      </w:r>
+      <w:r>
+        <w:t xml:space="preserve"/>
+      </w:r>
+      <w:r>
+        <w:rPr>
+          <w:rFonts w:ascii="Arial" w:cs="Arial" w:eastAsia="Arial" w:hAnsi="Arial"/>
+          <w:color w:val="3A3A36"/>
+          <w:sz w:val="21"/>
+          <w:szCs w:val="21"/>
+        </w:rPr>
+        <w:t xml:space="preserve">Come back to the Bitwarden item and save the new password so the vault stays the source of truth.</w:t>
+      </w:r>
+    </w:p>
+    <w:p>
+      <w:pPr>
+        <w:spacing w:after="90"/>
+        <w:ind w:left="360" w:hanging="260"/>
+      </w:pPr>
+      <w:r>
+        <w:rPr>
+          <w:rFonts w:ascii="Arial" w:cs="Arial" w:eastAsia="Arial" w:hAnsi="Arial"/>
+          <w:b/>
+          <w:bCs/>
+          <w:color w:val="D85A30"/>
+          <w:sz w:val="21"/>
+          <w:szCs w:val="21"/>
+        </w:rPr>
+        <w:t xml:space="preserve">5  </w:t>
+      </w:r>
+      <w:r>
+        <w:t xml:space="preserve"/>
+      </w:r>
+      <w:r>
+        <w:rPr>
+          <w:rFonts w:ascii="Arial" w:cs="Arial" w:eastAsia="Arial" w:hAnsi="Arial"/>
+          <w:color w:val="3A3A36"/>
+          <w:sz w:val="21"/>
+          <w:szCs w:val="21"/>
+        </w:rPr>
+        <w:t xml:space="preserve">Add a quick note in the item (who changed it and why) so there's a record if anyone asks later.</w:t>
       </w:r>
     </w:p>
     <w:p>
@@ -867,7 +1064,21 @@
           <w:sz w:val="24"/>
           <w:szCs w:val="24"/>
         </w:rPr>
-        <w:t xml:space="preserve">5. Roles &amp; Ownership</w:t>
+        <w:t xml:space="preserve">5. When To Rotate a Shared Credential</w:t>
+      </w:r>
+    </w:p>
+    <w:p>
+      <w:pPr>
+        <w:spacing w:after="160"/>
+      </w:pPr>
+      <w:r>
+        <w:rPr>
+          <w:rFonts w:ascii="Arial" w:cs="Arial" w:eastAsia="Arial" w:hAnsi="Arial"/>
+          <w:color w:val="3A3A36"/>
+          <w:sz w:val="21"/>
+          <w:szCs w:val="21"/>
+        </w:rPr>
+        <w:t xml:space="preserve">Trigger-based, not scheduled — change a shared password when one of these actually happens:</w:t>
       </w:r>
     </w:p>
     <w:p>
@@ -895,7 +1106,7 @@
           <w:sz w:val="21"/>
           <w:szCs w:val="21"/>
         </w:rPr>
-        <w:t xml:space="preserve">Bitwarden org owner/admin: the only role that can invite or remove people from the organization and manage collections. Currently the Hub owner account.</w:t>
+        <w:t xml:space="preserve">A teammate with access to it leaves the company or changes roles.</w:t>
       </w:r>
     </w:p>
     <w:p>
@@ -923,7 +1134,7 @@
           <w:sz w:val="21"/>
           <w:szCs w:val="21"/>
         </w:rPr>
-        <w:t xml:space="preserve">Who gets a seat first: not necessarily everyone on the Team Roster on day one — start with anyone who currently has, or needs, shared access to client ad accounts, hosting/domain logins, or other shared credentials (see the Bitwarden Rollout Plan's Rollout Steps).</w:t>
+        <w:t xml:space="preserve">A client relationship ends — rotate anything that was shared with or by that client.</w:t>
       </w:r>
     </w:p>
     <w:p>
@@ -951,7 +1162,63 @@
           <w:sz w:val="21"/>
           <w:szCs w:val="21"/>
         </w:rPr>
-        <w:t xml:space="preserve">Bitwarden access and Hub Team Access are two separate systems. Team Access controls what a teammate sees in the Hub's sidebar. Bitwarden controls actual passwords. Adding or removing someone from one does not affect the other — both need to be updated when someone joins, changes roles, or leaves.</w:t>
+        <w:t xml:space="preserve">A freelancer or contractor's engagement ends.</w:t>
+      </w:r>
+    </w:p>
+    <w:p>
+      <w:pPr>
+        <w:spacing w:after="70"/>
+        <w:ind w:left="300" w:hanging="200"/>
+      </w:pPr>
+      <w:r>
+        <w:rPr>
+          <w:rFonts w:ascii="Arial" w:cs="Arial" w:eastAsia="Arial" w:hAnsi="Arial"/>
+          <w:b/>
+          <w:bCs/>
+          <w:color w:val="D85A30"/>
+          <w:sz w:val="21"/>
+          <w:szCs w:val="21"/>
+        </w:rPr>
+        <w:t xml:space="preserve">•  </w:t>
+      </w:r>
+      <w:r>
+        <w:rPr>
+          <w:rFonts w:ascii="Arial" w:cs="Arial" w:eastAsia="Arial" w:hAnsi="Arial"/>
+          <w:b w:val="false"/>
+          <w:bCs w:val="false"/>
+          <w:color w:val="3A3A36"/>
+          <w:sz w:val="21"/>
+          <w:szCs w:val="21"/>
+        </w:rPr>
+        <w:t xml:space="preserve">You suspect exposure — a phishing click, a lost or compromised device, or a breach notification for that site.</w:t>
+      </w:r>
+    </w:p>
+    <w:p>
+      <w:pPr>
+        <w:spacing w:after="70"/>
+        <w:ind w:left="300" w:hanging="200"/>
+      </w:pPr>
+      <w:r>
+        <w:rPr>
+          <w:rFonts w:ascii="Arial" w:cs="Arial" w:eastAsia="Arial" w:hAnsi="Arial"/>
+          <w:b/>
+          <w:bCs/>
+          <w:color w:val="D85A30"/>
+          <w:sz w:val="21"/>
+          <w:szCs w:val="21"/>
+        </w:rPr>
+        <w:t xml:space="preserve">•  </w:t>
+      </w:r>
+      <w:r>
+        <w:rPr>
+          <w:rFonts w:ascii="Arial" w:cs="Arial" w:eastAsia="Arial" w:hAnsi="Arial"/>
+          <w:b w:val="false"/>
+          <w:bCs w:val="false"/>
+          <w:color w:val="3A3A36"/>
+          <w:sz w:val="21"/>
+          <w:szCs w:val="21"/>
+        </w:rPr>
+        <w:t xml:space="preserve">Bitwarden's built-in breach report (or a check against HaveIBeenPwned) flags a password as compromised.</w:t>
       </w:r>
     </w:p>
     <w:p>
@@ -967,7 +1234,7 @@
           <w:sz w:val="24"/>
           <w:szCs w:val="24"/>
         </w:rPr>
-        <w:t xml:space="preserve">6. Quick Reference Checklist</w:t>
+        <w:t xml:space="preserve">6. Roles &amp; Ownership</w:t>
       </w:r>
     </w:p>
     <w:p>
@@ -984,16 +1251,18 @@
           <w:sz w:val="21"/>
           <w:szCs w:val="21"/>
         </w:rPr>
-        <w:t xml:space="preserve">☐  </w:t>
-      </w:r>
-      <w:r>
-        <w:rPr>
-          <w:rFonts w:ascii="Arial" w:cs="Arial" w:eastAsia="Arial" w:hAnsi="Arial"/>
-          <w:color w:val="3A3A36"/>
-          <w:sz w:val="21"/>
-          <w:szCs w:val="21"/>
-        </w:rPr>
-        <w:t xml:space="preserve">Install the extension + app</w:t>
+        <w:t xml:space="preserve">•  </w:t>
+      </w:r>
+      <w:r>
+        <w:rPr>
+          <w:rFonts w:ascii="Arial" w:cs="Arial" w:eastAsia="Arial" w:hAnsi="Arial"/>
+          <w:b w:val="false"/>
+          <w:bCs w:val="false"/>
+          <w:color w:val="3A3A36"/>
+          <w:sz w:val="21"/>
+          <w:szCs w:val="21"/>
+        </w:rPr>
+        <w:t xml:space="preserve">Bitwarden org owner/admin: the only role that can invite or remove people from the organization and manage collections. Currently the Hub owner account.</w:t>
       </w:r>
     </w:p>
     <w:p>
@@ -1010,16 +1279,18 @@
           <w:sz w:val="21"/>
           <w:szCs w:val="21"/>
         </w:rPr>
-        <w:t xml:space="preserve">☐  </w:t>
-      </w:r>
-      <w:r>
-        <w:rPr>
-          <w:rFonts w:ascii="Arial" w:cs="Arial" w:eastAsia="Arial" w:hAnsi="Arial"/>
-          <w:color w:val="3A3A36"/>
-          <w:sz w:val="21"/>
-          <w:szCs w:val="21"/>
-        </w:rPr>
-        <w:t xml:space="preserve">Create your account with your work email, turn on 2FA</w:t>
+        <w:t xml:space="preserve">•  </w:t>
+      </w:r>
+      <w:r>
+        <w:rPr>
+          <w:rFonts w:ascii="Arial" w:cs="Arial" w:eastAsia="Arial" w:hAnsi="Arial"/>
+          <w:b w:val="false"/>
+          <w:bCs w:val="false"/>
+          <w:color w:val="3A3A36"/>
+          <w:sz w:val="21"/>
+          <w:szCs w:val="21"/>
+        </w:rPr>
+        <w:t xml:space="preserve">Who gets a seat first: not necessarily everyone on the Team Roster on day one — start with anyone who currently has, or needs, shared access to client ad accounts, hosting/domain logins, or other shared credentials (see the Bitwarden Rollout Plan's Rollout Steps).</w:t>
       </w:r>
     </w:p>
     <w:p>
@@ -1036,16 +1307,34 @@
           <w:sz w:val="21"/>
           <w:szCs w:val="21"/>
         </w:rPr>
-        <w:t xml:space="preserve">☐  </w:t>
-      </w:r>
-      <w:r>
-        <w:rPr>
-          <w:rFonts w:ascii="Arial" w:cs="Arial" w:eastAsia="Arial" w:hAnsi="Arial"/>
-          <w:color w:val="3A3A36"/>
-          <w:sz w:val="21"/>
-          <w:szCs w:val="21"/>
-        </w:rPr>
-        <w:t xml:space="preserve">Accept the organization invite once available</w:t>
+        <w:t xml:space="preserve">•  </w:t>
+      </w:r>
+      <w:r>
+        <w:rPr>
+          <w:rFonts w:ascii="Arial" w:cs="Arial" w:eastAsia="Arial" w:hAnsi="Arial"/>
+          <w:b w:val="false"/>
+          <w:bCs w:val="false"/>
+          <w:color w:val="3A3A36"/>
+          <w:sz w:val="21"/>
+          <w:szCs w:val="21"/>
+        </w:rPr>
+        <w:t xml:space="preserve">Bitwarden access, Hub Team Access, and Google Workspace are three separate systems. Team Access controls what a teammate sees in the Hub's sidebar. Bitwarden controls shared passwords. Workspace controls their actual email/Drive/Calendar login. Adding or removing someone from one does not affect the others — all three need to be updated when someone joins, changes roles, or leaves.</w:t>
+      </w:r>
+    </w:p>
+    <w:p>
+      <w:pPr>
+        <w:spacing w:after="80" w:before="260"/>
+      </w:pPr>
+      <w:r>
+        <w:rPr>
+          <w:rFonts w:ascii="Arial" w:cs="Arial" w:eastAsia="Arial" w:hAnsi="Arial"/>
+          <w:b/>
+          <w:bCs/>
+          <w:color w:val="1F2937"/>
+          <w:sz w:val="24"/>
+          <w:szCs w:val="24"/>
+        </w:rPr>
+        <w:t xml:space="preserve">7. Quick Reference Checklist</w:t>
       </w:r>
     </w:p>
     <w:p>
@@ -1071,7 +1360,7 @@
           <w:sz w:val="21"/>
           <w:szCs w:val="21"/>
         </w:rPr>
-        <w:t xml:space="preserve">Never reuse a password — let Bitwarden generate a unique one per login</w:t>
+        <w:t xml:space="preserve">Install the extension + app</w:t>
       </w:r>
     </w:p>
     <w:p>
@@ -1097,7 +1386,7 @@
           <w:sz w:val="21"/>
           <w:szCs w:val="21"/>
         </w:rPr>
-        <w:t xml:space="preserve">Never send a password in plaintext — use Send instead</w:t>
+        <w:t xml:space="preserve">Create your account with your work email, turn on 2FA</w:t>
       </w:r>
     </w:p>
     <w:p>
@@ -1123,7 +1412,7 @@
           <w:sz w:val="21"/>
           <w:szCs w:val="21"/>
         </w:rPr>
-        <w:t xml:space="preserve">Rotate on suspected compromise or offboarding, not on a calendar</w:t>
+        <w:t xml:space="preserve">Accept the organization invite once available</w:t>
       </w:r>
     </w:p>
     <w:p>
@@ -1149,7 +1438,111 @@
           <w:sz w:val="21"/>
           <w:szCs w:val="21"/>
         </w:rPr>
-        <w:t xml:space="preserve">Offboarding a teammate or contractor = rotate everything they had access to, in both Bitwarden and Team Access</w:t>
+        <w:t xml:space="preserve">Never reuse a password — let Bitwarden generate a unique one per login</w:t>
+      </w:r>
+    </w:p>
+    <w:p>
+      <w:pPr>
+        <w:spacing w:after="70"/>
+        <w:ind w:left="300" w:hanging="200"/>
+      </w:pPr>
+      <w:r>
+        <w:rPr>
+          <w:rFonts w:ascii="Arial" w:cs="Arial" w:eastAsia="Arial" w:hAnsi="Arial"/>
+          <w:b/>
+          <w:bCs/>
+          <w:color w:val="D85A30"/>
+          <w:sz w:val="21"/>
+          <w:szCs w:val="21"/>
+        </w:rPr>
+        <w:t xml:space="preserve">☐  </w:t>
+      </w:r>
+      <w:r>
+        <w:rPr>
+          <w:rFonts w:ascii="Arial" w:cs="Arial" w:eastAsia="Arial" w:hAnsi="Arial"/>
+          <w:color w:val="3A3A36"/>
+          <w:sz w:val="21"/>
+          <w:szCs w:val="21"/>
+        </w:rPr>
+        <w:t xml:space="preserve">Never send a password in plaintext — use Send instead</w:t>
+      </w:r>
+    </w:p>
+    <w:p>
+      <w:pPr>
+        <w:spacing w:after="70"/>
+        <w:ind w:left="300" w:hanging="200"/>
+      </w:pPr>
+      <w:r>
+        <w:rPr>
+          <w:rFonts w:ascii="Arial" w:cs="Arial" w:eastAsia="Arial" w:hAnsi="Arial"/>
+          <w:b/>
+          <w:bCs/>
+          <w:color w:val="D85A30"/>
+          <w:sz w:val="21"/>
+          <w:szCs w:val="21"/>
+        </w:rPr>
+        <w:t xml:space="preserve">☐  </w:t>
+      </w:r>
+      <w:r>
+        <w:rPr>
+          <w:rFonts w:ascii="Arial" w:cs="Arial" w:eastAsia="Arial" w:hAnsi="Arial"/>
+          <w:color w:val="3A3A36"/>
+          <w:sz w:val="21"/>
+          <w:szCs w:val="21"/>
+        </w:rPr>
+        <w:t xml:space="preserve">Rotate on suspected compromise or offboarding, not on a calendar</w:t>
+      </w:r>
+    </w:p>
+    <w:p>
+      <w:pPr>
+        <w:spacing w:after="70"/>
+        <w:ind w:left="300" w:hanging="200"/>
+      </w:pPr>
+      <w:r>
+        <w:rPr>
+          <w:rFonts w:ascii="Arial" w:cs="Arial" w:eastAsia="Arial" w:hAnsi="Arial"/>
+          <w:b/>
+          <w:bCs/>
+          <w:color w:val="D85A30"/>
+          <w:sz w:val="21"/>
+          <w:szCs w:val="21"/>
+        </w:rPr>
+        <w:t xml:space="preserve">☐  </w:t>
+      </w:r>
+      <w:r>
+        <w:rPr>
+          <w:rFonts w:ascii="Arial" w:cs="Arial" w:eastAsia="Arial" w:hAnsi="Arial"/>
+          <w:color w:val="3A3A36"/>
+          <w:sz w:val="21"/>
+          <w:szCs w:val="21"/>
+        </w:rPr>
+        <w:t xml:space="preserve">Enforce domain-wide 2-Step Verification in the Google Admin console</w:t>
+      </w:r>
+    </w:p>
+    <w:p>
+      <w:pPr>
+        <w:spacing w:after="70"/>
+        <w:ind w:left="300" w:hanging="200"/>
+      </w:pPr>
+      <w:r>
+        <w:rPr>
+          <w:rFonts w:ascii="Arial" w:cs="Arial" w:eastAsia="Arial" w:hAnsi="Arial"/>
+          <w:b/>
+          <w:bCs/>
+          <w:color w:val="D85A30"/>
+          <w:sz w:val="21"/>
+          <w:szCs w:val="21"/>
+        </w:rPr>
+        <w:t xml:space="preserve">☐  </w:t>
+      </w:r>
+      <w:r>
+        <w:rPr>
+          <w:rFonts w:ascii="Arial" w:cs="Arial" w:eastAsia="Arial" w:hAnsi="Arial"/>
+          <w:color w:val="3A3A36"/>
+          <w:sz w:val="21"/>
+          <w:szCs w:val="21"/>
+        </w:rPr>
+        <w:t xml:space="preserve">Offboarding = suspend (don't delete) the Workspace account, transfer their data, rotate Bitwarden credentials, and update Hub Team Access — all three, every time</w:t>
       </w:r>
     </w:p>
     <w:p>

</xml_diff>